<commit_message>
Papers B: integrate k-scan discriminant experiment (K1-K5) + T1-T3 mechanism checks + 27000-iters focused scan (N* in [448,480], 4/3=384 hypothesis negated); fix stale cutoff ~384 across draft/canonical/formal (7.50->5.15, -31%); sync papers + docx
</commit_message>
<xml_diff>
--- a/papers/论文A中文规范版-CertifiedSparseGating-v2.1-20260823.docx
+++ b/papers/论文A中文规范版-CertifiedSparseGating-v2.1-20260823.docx
@@ -9477,7 +9477,7 @@
       </w:r>
     </w:p>
     <w:bookmarkEnd w:id="22"/>
-    <w:bookmarkStart w:id="23" w:name="X8720c50964cf28edde8e5ca2c1dae3ba8a48d2b"/>
+    <w:bookmarkStart w:id="23" w:name="Xb711ddc3c0669a6253c790f799d9aa140264454"/>
     <w:p>
       <w:pPr>
         <w:pStyle w:val="Heading3"/>
@@ -9498,16 +9498,25 @@
         <w:rPr>
           <w:rFonts w:hint="eastAsia"/>
         </w:rPr>
-        <w:t xml:space="preserve">区探针；parseval/partial/pairdirichlet/pairbound/rowsum</w:t>
-      </w:r>
-      <w:r>
-        <w:t xml:space="preserve"> </w:t>
-      </w:r>
-      <w:r>
-        <w:rPr>
-          <w:rFonts w:hint="eastAsia"/>
-        </w:rPr>
-        <w:t xml:space="preserve">已并入合并版，v2.1）</w:t>
+        <w:t xml:space="preserve">区探针；grid_ortho</w:t>
+      </w:r>
+      <w:r>
+        <w:t xml:space="preserve"> + parseval/partial/pairdirichlet/pairbound/rowsum/incoherence </w:t>
+      </w:r>
+      <w:r>
+        <w:rPr>
+          <w:rFonts w:hint="eastAsia"/>
+        </w:rPr>
+        <w:t xml:space="preserve">共</w:t>
+      </w:r>
+      <w:r>
+        <w:t xml:space="preserve"> 7 </w:t>
+      </w:r>
+      <w:r>
+        <w:rPr>
+          <w:rFonts w:hint="eastAsia"/>
+        </w:rPr>
+        <w:t xml:space="preserve">个已并入合并版，v2.1）</w:t>
       </w:r>
     </w:p>
     <w:p>

</xml_diff>

<commit_message>
Papers A/B: add code repository (Artifact) link to appendixes + references + formal versions (github.com/hy7pc8gfmf-dotcom/PSA-CertifiedSparseGating, Apache-2.0, CI badge)
</commit_message>
<xml_diff>
--- a/papers/论文A中文规范版-CertifiedSparseGating-v2.1-20260823.docx
+++ b/papers/论文A中文规范版-CertifiedSparseGating-v2.1-20260823.docx
@@ -15162,6 +15162,66 @@
         <w:t xml:space="preserve">文献数据库核查校准（核查报告：《参考文献真实性核查报告》）。</w:t>
       </w:r>
     </w:p>
+    <w:p>
+      <w:pPr>
+        <w:pStyle w:val="Compact"/>
+        <w:numPr>
+          <w:ilvl w:val="0"/>
+          <w:numId w:val="1018"/>
+        </w:numPr>
+      </w:pPr>
+      <w:r>
+        <w:rPr>
+          <w:rFonts w:hint="eastAsia"/>
+        </w:rPr>
+        <w:t xml:space="preserve">[代码仓库]</w:t>
+      </w:r>
+      <w:r>
+        <w:t xml:space="preserve"> PSA-CertifiedSparseGating. https://github.com/hy7pc8gfmf-dotcom/PSA-CertifiedSparseGating </w:t>
+      </w:r>
+      <w:r>
+        <w:rPr>
+          <w:rFonts w:hint="eastAsia"/>
+        </w:rPr>
+        <w:t xml:space="preserve">（Artifact：Coq</w:t>
+      </w:r>
+      <w:r>
+        <w:t xml:space="preserve"> </w:t>
+      </w:r>
+      <w:r>
+        <w:rPr>
+          <w:rFonts w:hint="eastAsia"/>
+        </w:rPr>
+        <w:t xml:space="preserve">形式化</w:t>
+      </w:r>
+      <w:r>
+        <w:t xml:space="preserve"> + </w:t>
+      </w:r>
+      <w:r>
+        <w:rPr>
+          <w:rFonts w:hint="eastAsia"/>
+        </w:rPr>
+        <w:t xml:space="preserve">论文</w:t>
+      </w:r>
+      <w:r>
+        <w:t xml:space="preserve"> + </w:t>
+      </w:r>
+      <w:r>
+        <w:rPr>
+          <w:rFonts w:hint="eastAsia"/>
+        </w:rPr>
+        <w:t xml:space="preserve">实证</w:t>
+      </w:r>
+      <w:r>
+        <w:t xml:space="preserve"> + </w:t>
+      </w:r>
+      <w:r>
+        <w:rPr>
+          <w:rFonts w:hint="eastAsia"/>
+        </w:rPr>
+        <w:t xml:space="preserve">CI，Apache-2.0）。</w:t>
+      </w:r>
+    </w:p>
     <w:bookmarkEnd w:id="33"/>
     <w:bookmarkStart w:id="34" w:name="附录-复现指引"/>
     <w:p>
@@ -15182,6 +15242,115 @@
           <w:rFonts w:hint="eastAsia"/>
         </w:rPr>
         <w:t xml:space="preserve">复现指引</w:t>
+      </w:r>
+    </w:p>
+    <w:p>
+      <w:pPr>
+        <w:pStyle w:val="BlockText"/>
+      </w:pPr>
+      <w:r>
+        <w:rPr>
+          <w:rFonts w:hint="eastAsia"/>
+          <w:b/>
+          <w:bCs/>
+        </w:rPr>
+        <w:t xml:space="preserve">代码仓库（Artifact）</w:t>
+      </w:r>
+      <w:r>
+        <w:rPr>
+          <w:rFonts w:hint="eastAsia"/>
+        </w:rPr>
+        <w:t xml:space="preserve">：https://github.com/hy7pc8gfmf-dotcom/PSA-CertifiedSparseGating</w:t>
+      </w:r>
+      <w:r>
+        <w:t xml:space="preserve"> —— </w:t>
+      </w:r>
+      <w:r>
+        <w:rPr>
+          <w:rFonts w:hint="eastAsia"/>
+        </w:rPr>
+        <w:t xml:space="preserve">含全部</w:t>
+      </w:r>
+      <w:r>
+        <w:t xml:space="preserve"> Coq </w:t>
+      </w:r>
+      <w:r>
+        <w:rPr>
+          <w:rFonts w:hint="eastAsia"/>
+        </w:rPr>
+        <w:t xml:space="preserve">形式化（coq/lib</w:t>
+      </w:r>
+      <w:r>
+        <w:t xml:space="preserve"> + coq/core + </w:t>
+      </w:r>
+      <w:r>
+        <w:rPr>
+          <w:rFonts w:hint="eastAsia"/>
+        </w:rPr>
+        <w:t xml:space="preserve">coq/probes）、两篇论文（草稿/正式版/中文规范版）、实证脚本与数据（mpirical/、data/）、CI</w:t>
+      </w:r>
+      <w:r>
+        <w:t xml:space="preserve"> </w:t>
+      </w:r>
+      <w:r>
+        <w:rPr>
+          <w:rFonts w:hint="eastAsia"/>
+        </w:rPr>
+        <w:t xml:space="preserve">流水线（GitHub</w:t>
+      </w:r>
+      <w:r>
+        <w:t xml:space="preserve"> </w:t>
+      </w:r>
+      <w:r>
+        <w:rPr>
+          <w:rFonts w:hint="eastAsia"/>
+        </w:rPr>
+        <w:t xml:space="preserve">Actions：Rocq</w:t>
+      </w:r>
+      <w:r>
+        <w:t xml:space="preserve"> 9.0 </w:t>
+      </w:r>
+      <w:r>
+        <w:rPr>
+          <w:rFonts w:hint="eastAsia"/>
+        </w:rPr>
+        <w:t xml:space="preserve">编译</w:t>
+      </w:r>
+      <w:r>
+        <w:t xml:space="preserve"> + 165 </w:t>
+      </w:r>
+      <w:r>
+        <w:rPr>
+          <w:rFonts w:hint="eastAsia"/>
+        </w:rPr>
+        <w:t xml:space="preserve">项审计</w:t>
+      </w:r>
+      <w:r>
+        <w:t xml:space="preserve"> + coqchk </w:t>
+      </w:r>
+      <w:r>
+        <w:rPr>
+          <w:rFonts w:hint="eastAsia"/>
+        </w:rPr>
+        <w:t xml:space="preserve">内核复验，徽章见仓库</w:t>
+      </w:r>
+      <w:r>
+        <w:t xml:space="preserve"> </w:t>
+      </w:r>
+      <w:r>
+        <w:rPr>
+          <w:rFonts w:hint="eastAsia"/>
+        </w:rPr>
+        <w:t xml:space="preserve">README）。预印本</w:t>
+      </w:r>
+      <w:r>
+        <w:t xml:space="preserve"> </w:t>
+      </w:r>
+      <w:r>
+        <w:rPr>
+          <w:rFonts w:hint="eastAsia"/>
+        </w:rPr>
+        <w:t xml:space="preserve">DOI：10.6084/m9.figshare.33312189。</w:t>
       </w:r>
     </w:p>
     <w:p>

</xml_diff>

<commit_message>
Paper A: apply CPP/ITP major-revision review (建议-03) — drop 'complete pipeline' (two orthogonal certified tracks); weaken reflective-checker to sufficient/conservative (49.1% FN); downgrade CS claims to generic-layer + instance splicing as future work; math-novelty caveat (Gershgorin/inter-coherence, not new); add safety-domain predicate future work (Zarith); axiom wording Classical_Prop.classic-free
</commit_message>
<xml_diff>
--- a/papers/论文A中文规范版-CertifiedSparseGating-v2.1-20260823.docx
+++ b/papers/论文A中文规范版-CertifiedSparseGating-v2.1-20260823.docx
@@ -270,7 +270,7 @@
         <w:rPr>
           <w:rFonts w:hint="eastAsia"/>
         </w:rPr>
-        <w:t xml:space="preserve">形式化开发，覆盖”可认证稀疏门控注意力”在几何结构化频率基上的完整流水线。开发在</w:t>
+        <w:t xml:space="preserve">形式化开发，覆盖”可认证稀疏门控注意力”在几何结构化频率基上的解析核。开发在</w:t>
       </w:r>
       <w:r>
         <w:rPr>
@@ -754,7 +754,30 @@
         <w:rPr>
           <w:rFonts w:hint="eastAsia"/>
         </w:rPr>
-        <w:t xml:space="preserve">的可判定判定，提取为带原生整数镜像的</w:t>
+        <w:t xml:space="preserve">的可判定</w:t>
+      </w:r>
+      <w:r>
+        <w:rPr>
+          <w:rFonts w:hint="eastAsia"/>
+          <w:b/>
+          <w:bCs/>
+        </w:rPr>
+        <w:t xml:space="preserve">充分</w:t>
+      </w:r>
+      <w:r>
+        <w:rPr>
+          <w:rFonts w:hint="eastAsia"/>
+        </w:rPr>
+        <w:t xml:space="preserve">判定——保守健全，系统扫描假阴性</w:t>
+      </w:r>
+      <w:r>
+        <w:t xml:space="preserve"> </w:t>
+      </w:r>
+      <w:r>
+        <w:rPr>
+          <w:rFonts w:hint="eastAsia"/>
+        </w:rPr>
+        <w:t xml:space="preserve">49.1%；提取为带原生整数镜像的</w:t>
       </w:r>
       <w:r>
         <w:t xml:space="preserve"> </w:t>
@@ -2553,7 +2576,30 @@
         <w:rPr>
           <w:rFonts w:hint="eastAsia"/>
         </w:rPr>
-        <w:t xml:space="preserve">μ≤4/5”做成可判定有理判定，提取为原生整数镜像（与</w:t>
+        <w:t xml:space="preserve">μ≤4/5”做成可判定</w:t>
+      </w:r>
+      <w:r>
+        <w:rPr>
+          <w:rFonts w:hint="eastAsia"/>
+          <w:b/>
+          <w:bCs/>
+        </w:rPr>
+        <w:t xml:space="preserve">充分</w:t>
+      </w:r>
+      <w:r>
+        <w:rPr>
+          <w:rFonts w:hint="eastAsia"/>
+        </w:rPr>
+        <w:t xml:space="preserve">判定（保守健全，系统扫描假阴性</w:t>
+      </w:r>
+      <w:r>
+        <w:t xml:space="preserve"> </w:t>
+      </w:r>
+      <w:r>
+        <w:rPr>
+          <w:rFonts w:hint="eastAsia"/>
+        </w:rPr>
+        <w:t xml:space="preserve">49.1%），提取为原生整数镜像（与</w:t>
       </w:r>
       <w:r>
         <w:t xml:space="preserve"> Coq </w:t>
@@ -2577,7 +2623,28 @@
         <w:rPr>
           <w:rFonts w:hint="eastAsia"/>
         </w:rPr>
-        <w:t xml:space="preserve">（Qed）证明判定通过</w:t>
+        <w:t xml:space="preserve">（Qed）证明</w:t>
+      </w:r>
+      <w:r>
+        <w:rPr>
+          <w:b/>
+          <w:bCs/>
+        </w:rPr>
+        <w:t xml:space="preserve">Coq </w:t>
+      </w:r>
+      <w:r>
+        <w:rPr>
+          <w:rFonts w:hint="eastAsia"/>
+          <w:b/>
+          <w:bCs/>
+        </w:rPr>
+        <w:t xml:space="preserve">内</w:t>
+      </w:r>
+      <w:r>
+        <w:rPr>
+          <w:rFonts w:hint="eastAsia"/>
+        </w:rPr>
+        <w:t xml:space="preserve">判定通过</w:t>
       </w:r>
       <w:r>
         <w:t xml:space="preserve"> ⟹ Gershgorin </w:t>
@@ -2586,7 +2653,25 @@
         <w:rPr>
           <w:rFonts w:hint="eastAsia"/>
         </w:rPr>
-        <w:t xml:space="preserve">框架界——检查器本身带机器证明的健全性；</w:t>
+        <w:t xml:space="preserve">框架界——检查器带</w:t>
+      </w:r>
+      <w:r>
+        <w:t xml:space="preserve"> Coq </w:t>
+      </w:r>
+      <w:r>
+        <w:rPr>
+          <w:rFonts w:hint="eastAsia"/>
+        </w:rPr>
+        <w:t xml:space="preserve">内健全性证明，运行时</w:t>
+      </w:r>
+      <w:r>
+        <w:t xml:space="preserve"> int </w:t>
+      </w:r>
+      <w:r>
+        <w:rPr>
+          <w:rFonts w:hint="eastAsia"/>
+        </w:rPr>
+        <w:t xml:space="preserve">镜像为交叉验证（未形式化验证，§6）；</w:t>
       </w:r>
     </w:p>
     <w:p>
@@ -11738,54 +11823,125 @@
           <w:b/>
           <w:bCs/>
         </w:rPr>
-        <w:t xml:space="preserve">意义</w:t>
-      </w:r>
-      <w:r>
-        <w:rPr>
-          <w:rFonts w:hint="eastAsia"/>
-        </w:rPr>
-        <w:t xml:space="preserve">：本开发首次获得</w:t>
-      </w:r>
-      <w:r>
-        <w:rPr>
-          <w:rFonts w:hint="eastAsia"/>
-          <w:b/>
-          <w:bCs/>
-        </w:rPr>
-        <w:t xml:space="preserve">可认证稀疏恢复</w:t>
-      </w:r>
-      <w:r>
-        <w:rPr>
-          <w:rFonts w:hint="eastAsia"/>
-        </w:rPr>
-        <w:t xml:space="preserve">的理论保证——与框架界正交（框架界</w:t>
-      </w:r>
-      <w:r>
-        <w:t xml:space="preserve"> = </w:t>
-      </w:r>
-      <w:r>
-        <w:rPr>
-          <w:rFonts w:hint="eastAsia"/>
-        </w:rPr>
-        <w:t xml:space="preserve">表示存在</w:t>
-      </w:r>
-      <w:r>
-        <w:t xml:space="preserve"> </w:t>
-      </w:r>
-      <w:r>
-        <w:rPr>
-          <w:rFonts w:hint="eastAsia"/>
-        </w:rPr>
-        <w:t xml:space="preserve">且稳定；RIP/唯一性</w:t>
-      </w:r>
-      <w:r>
-        <w:t xml:space="preserve"> = </w:t>
-      </w:r>
-      <w:r>
-        <w:rPr>
-          <w:rFonts w:hint="eastAsia"/>
-        </w:rPr>
-        <w:t xml:space="preserve">稀疏表示唯一可恢复）；与</w:t>
+        <w:t xml:space="preserve">意义（强度如实声明）</w:t>
+      </w:r>
+      <w:r>
+        <w:rPr>
+          <w:rFonts w:hint="eastAsia"/>
+        </w:rPr>
+        <w:t xml:space="preserve">：本开发在</w:t>
+      </w:r>
+      <w:r>
+        <w:rPr>
+          <w:rFonts w:hint="eastAsia"/>
+          <w:b/>
+          <w:bCs/>
+        </w:rPr>
+        <w:t xml:space="preserve">通用层</w:t>
+      </w:r>
+      <w:r>
+        <w:rPr>
+          <w:rFonts w:hint="eastAsia"/>
+        </w:rPr>
+        <w:t xml:space="preserve">建立可认证稀疏恢复的理论保证（单位范数</w:t>
+      </w:r>
+      <w:r>
+        <w:t xml:space="preserve"> + RIP(2,μ) + </w:t>
+      </w:r>
+      <w:r>
+        <w:rPr>
+          <w:rFonts w:hint="eastAsia"/>
+        </w:rPr>
+        <w:t xml:space="preserve">稀疏唯一性三定理，机器检查）；</w:t>
+      </w:r>
+      <w:r>
+        <w:rPr>
+          <w:rFonts w:hint="eastAsia"/>
+          <w:b/>
+          <w:bCs/>
+        </w:rPr>
+        <w:t xml:space="preserve">具体实例拼接（如</w:t>
+      </w:r>
+      <w:r>
+        <w:rPr>
+          <w:b/>
+          <w:bCs/>
+        </w:rPr>
+        <w:t xml:space="preserve"> C=4 </w:t>
+      </w:r>
+      <w:r>
+        <w:rPr>
+          <w:rFonts w:hint="eastAsia"/>
+          <w:b/>
+          <w:bCs/>
+        </w:rPr>
+        <w:t xml:space="preserve">阶梯</w:t>
+      </w:r>
+      <w:r>
+        <w:rPr>
+          <w:b/>
+          <w:bCs/>
+        </w:rPr>
+        <w:t xml:space="preserve"> [3,13,53,213] </w:t>
+      </w:r>
+      <w:r>
+        <w:rPr>
+          <w:rFonts w:hint="eastAsia"/>
+          <w:b/>
+          <w:bCs/>
+        </w:rPr>
+        <w:t xml:space="preserve">的</w:t>
+      </w:r>
+      <w:r>
+        <w:rPr>
+          <w:b/>
+          <w:bCs/>
+        </w:rPr>
+        <w:t xml:space="preserve"> μ·(M+1)&lt;1 </w:t>
+      </w:r>
+      <w:r>
+        <w:rPr>
+          <w:rFonts w:hint="eastAsia"/>
+          <w:b/>
+          <w:bCs/>
+        </w:rPr>
+        <w:t xml:space="preserve">实例化，需精确</w:t>
+      </w:r>
+      <w:r>
+        <w:rPr>
+          <w:b/>
+          <w:bCs/>
+        </w:rPr>
+        <w:t xml:space="preserve"> μ </w:t>
+      </w:r>
+      <w:r>
+        <w:rPr>
+          <w:rFonts w:hint="eastAsia"/>
+          <w:b/>
+          <w:bCs/>
+        </w:rPr>
+        <w:t xml:space="preserve">值的</w:t>
+      </w:r>
+      <w:r>
+        <w:rPr>
+          <w:b/>
+          <w:bCs/>
+        </w:rPr>
+        <w:t xml:space="preserve"> Coq </w:t>
+      </w:r>
+      <w:r>
+        <w:rPr>
+          <w:rFonts w:hint="eastAsia"/>
+          <w:b/>
+          <w:bCs/>
+        </w:rPr>
+        <w:t xml:space="preserve">证明）尚未完成，为后续工作</w:t>
+      </w:r>
+      <w:r>
+        <w:rPr>
+          <w:rFonts w:hint="eastAsia"/>
+        </w:rPr>
+        <w:t xml:space="preserve">——故不宣称”实例级稀疏唯一恢复”已证；与</w:t>
       </w:r>
       <w:r>
         <w:t xml:space="preserve"> ρ^{−3/2} </w:t>
@@ -11806,25 +11962,13 @@
         <w:t xml:space="preserve">行和</w:t>
       </w:r>
       <w:r>
-        <w:t xml:space="preserve"> </w:t>
-      </w:r>
-      <w:r>
-        <w:t xml:space="preserve">2π/7 &lt; </w:t>
-      </w:r>
-      <w:r>
-        <w:rPr>
-          <w:rFonts w:hint="eastAsia"/>
-        </w:rPr>
-        <w:t xml:space="preserve">1）合成时，频率阶梯在</w:t>
-      </w:r>
-      <w:r>
-        <w:t xml:space="preserve"> C=4 </w:t>
-      </w:r>
-      <w:r>
-        <w:rPr>
-          <w:rFonts w:hint="eastAsia"/>
-        </w:rPr>
-        <w:t xml:space="preserve">同时满足框架界与低相干前提，是「稀疏</w:t>
+        <w:t xml:space="preserve"> 2π/7 &lt; </w:t>
+      </w:r>
+      <w:r>
+        <w:rPr>
+          <w:rFonts w:hint="eastAsia"/>
+        </w:rPr>
+        <w:t xml:space="preserve">1）的合成同为文本叙述而非形式化定理（框架界</w:t>
       </w:r>
       <w:r>
         <w:t xml:space="preserve"> + </w:t>
@@ -11833,16 +11977,81 @@
         <w:rPr>
           <w:rFonts w:hint="eastAsia"/>
         </w:rPr>
-        <w:t xml:space="preserve">稳定」双证书</w:t>
-      </w:r>
-      <w:r>
-        <w:t xml:space="preserve"> </w:t>
-      </w:r>
-      <w:r>
-        <w:rPr>
-          <w:rFonts w:hint="eastAsia"/>
-        </w:rPr>
-        <w:t xml:space="preserve">的机器检查基础。</w:t>
+        <w:t xml:space="preserve">低相干的组合实例拼接同为未来工作）。形式化贡献定位为：通用层</w:t>
+      </w:r>
+      <w:r>
+        <w:t xml:space="preserve"> </w:t>
+      </w:r>
+      <w:r>
+        <w:rPr>
+          <w:rFonts w:hint="eastAsia"/>
+        </w:rPr>
+        <w:t xml:space="preserve">RIP/唯一性定理的机器检查</w:t>
+      </w:r>
+      <w:r>
+        <w:t xml:space="preserve"> + </w:t>
+      </w:r>
+      <w:r>
+        <w:rPr>
+          <w:rFonts w:hint="eastAsia"/>
+        </w:rPr>
+        <w:t xml:space="preserve">原子族单位范数证明；实例层拼接是明确的后续步骤。</w:t>
+      </w:r>
+      <w:r>
+        <w:rPr>
+          <w:rFonts w:hint="eastAsia"/>
+          <w:b/>
+          <w:bCs/>
+        </w:rPr>
+        <w:t xml:space="preserve">数学新颖性说明（如实）</w:t>
+      </w:r>
+      <w:r>
+        <w:rPr>
+          <w:rFonts w:hint="eastAsia"/>
+        </w:rPr>
+        <w:t xml:space="preserve">：</w:t>
+      </w:r>
+      <w:r>
+        <w:rPr>
+          <w:rStyle w:val="VerbatimChar"/>
+        </w:rPr>
+        <w:t xml:space="preserve">sparse_uniquenessM</w:t>
+      </w:r>
+      <w:r>
+        <w:t xml:space="preserve"> </w:t>
+      </w:r>
+      <w:r>
+        <w:rPr>
+          <w:rFonts w:hint="eastAsia"/>
+        </w:rPr>
+        <w:t xml:space="preserve">本质是</w:t>
+      </w:r>
+      <w:r>
+        <w:t xml:space="preserve"> </w:t>
+      </w:r>
+      <w:r>
+        <w:rPr>
+          <w:rFonts w:hint="eastAsia"/>
+        </w:rPr>
+        <w:t xml:space="preserve">Gershgorin/互干性唯一恢复定理（Candès–Tao</w:t>
+      </w:r>
+      <w:r>
+        <w:t xml:space="preserve"> RIP </w:t>
+      </w:r>
+      <w:r>
+        <w:rPr>
+          <w:rFonts w:hint="eastAsia"/>
+        </w:rPr>
+        <w:t xml:space="preserve">框架下的经典结果），数学上并非新颖——本工作的形式化价值在于用</w:t>
+      </w:r>
+      <w:r>
+        <w:t xml:space="preserve"> Coq </w:t>
+      </w:r>
+      <w:r>
+        <w:rPr>
+          <w:rFonts w:hint="eastAsia"/>
+        </w:rPr>
+        <w:t xml:space="preserve">机器检查该定理在频率阶梯原子族上的成立，而非提出新数学定理。</w:t>
       </w:r>
     </w:p>
     <w:bookmarkEnd w:id="25"/>
@@ -12290,6 +12499,84 @@
           <w:rFonts w:hint="eastAsia"/>
         </w:rPr>
         <w:t xml:space="preserve">大整数）。</w:t>
+      </w:r>
+      <w:r>
+        <w:rPr>
+          <w:rFonts w:hint="eastAsia"/>
+          <w:b/>
+          <w:bCs/>
+        </w:rPr>
+        <w:t xml:space="preserve">安全域谓词（未来工作，评审建议）</w:t>
+      </w:r>
+      <w:r>
+        <w:rPr>
+          <w:rFonts w:hint="eastAsia"/>
+        </w:rPr>
+        <w:t xml:space="preserve">：当前”安全区”的确认是实验性的（扫描核算），</w:t>
+      </w:r>
+      <w:r>
+        <w:rPr>
+          <w:rFonts w:hint="eastAsia"/>
+          <w:b/>
+          <w:bCs/>
+        </w:rPr>
+        <w:t xml:space="preserve">未被形式化</w:t>
+      </w:r>
+      <w:r>
+        <w:rPr>
+          <w:rFonts w:hint="eastAsia"/>
+        </w:rPr>
+        <w:t xml:space="preserve">——用户无法在运行时自动判断当前输入是否安全；未来工作包括在</w:t>
+      </w:r>
+      <w:r>
+        <w:t xml:space="preserve"> Coq </w:t>
+      </w:r>
+      <w:r>
+        <w:rPr>
+          <w:rFonts w:hint="eastAsia"/>
+        </w:rPr>
+        <w:t xml:space="preserve">中证明一个可验证的</w:t>
+      </w:r>
+      <w:r>
+        <w:rPr>
+          <w:rFonts w:hint="eastAsia"/>
+          <w:b/>
+          <w:bCs/>
+        </w:rPr>
+        <w:t xml:space="preserve">安全域谓词</w:t>
+      </w:r>
+      <w:r>
+        <w:rPr>
+          <w:rFonts w:hint="eastAsia"/>
+        </w:rPr>
+        <w:t xml:space="preserve">（在满足该谓词的输入范围内，OCaml</w:t>
+      </w:r>
+      <w:r>
+        <w:t xml:space="preserve"> int </w:t>
+      </w:r>
+      <w:r>
+        <w:rPr>
+          <w:rFonts w:hint="eastAsia"/>
+        </w:rPr>
+        <w:t xml:space="preserve">镜像与</w:t>
+      </w:r>
+      <w:r>
+        <w:t xml:space="preserve"> Coq </w:t>
+      </w:r>
+      <w:r>
+        <w:rPr>
+          <w:rFonts w:hint="eastAsia"/>
+        </w:rPr>
+        <w:t xml:space="preserve">语义一致），或完成</w:t>
+      </w:r>
+      <w:r>
+        <w:t xml:space="preserve"> Zarith </w:t>
+      </w:r>
+      <w:r>
+        <w:rPr>
+          <w:rFonts w:hint="eastAsia"/>
+        </w:rPr>
+        <w:t xml:space="preserve">任意精度提取。</w:t>
       </w:r>
     </w:p>
     <w:p>

</xml_diff>

<commit_message>
Paper A: apply 2nd CPP/ITP review (建议-03 v2) — high-dim 'unconditional basis' -> 'norm upper bound (combinatorial demo, trivial lower bound)'; CS section as generic-layer (instance splicing future work); axiom: 'zero Classical_Prop.classic' with sig_not_dec/sig_forall_dec/fext; external deps (mathcomp/Coquelicot) not in 165-audit; paper-B dependency noted (preprint, not reviewed here)
</commit_message>
<xml_diff>
--- a/papers/论文A中文规范版-CertifiedSparseGating-v2.1-20260823.docx
+++ b/papers/论文A中文规范版-CertifiedSparseGating-v2.1-20260823.docx
@@ -1571,57 +1571,60 @@
           <w:b/>
           <w:bCs/>
         </w:rPr>
-        <w:t xml:space="preserve">压缩感知级理论保证（v2.1</w:t>
-      </w:r>
-      <w:r>
-        <w:rPr>
-          <w:b/>
-          <w:bCs/>
-        </w:rPr>
-        <w:t xml:space="preserve"> </w:t>
-      </w:r>
-      <w:r>
-        <w:rPr>
-          <w:rFonts w:hint="eastAsia"/>
-          <w:b/>
-          <w:bCs/>
-        </w:rPr>
-        <w:t xml:space="preserve">新增，§5.6.6）</w:t>
-      </w:r>
-      <w:r>
-        <w:rPr>
-          <w:rFonts w:hint="eastAsia"/>
-        </w:rPr>
-        <w:t xml:space="preserve">：频率阶梯原子族满足</w:t>
-      </w:r>
-      <w:r>
-        <w:rPr>
-          <w:rFonts w:hint="eastAsia"/>
-          <w:b/>
-          <w:bCs/>
-        </w:rPr>
-        <w:t xml:space="preserve">单位范数</w:t>
-      </w:r>
-      <w:r>
-        <w:rPr>
-          <w:b/>
-          <w:bCs/>
-        </w:rPr>
+        <w:t xml:space="preserve">压缩感知通用层形式化（v2.1</w:t>
+      </w:r>
+      <w:r>
+        <w:rPr>
+          <w:b/>
+          <w:bCs/>
+        </w:rPr>
+        <w:t xml:space="preserve"> </w:t>
+      </w:r>
+      <w:r>
+        <w:rPr>
+          <w:rFonts w:hint="eastAsia"/>
+          <w:b/>
+          <w:bCs/>
+        </w:rPr>
+        <w:t xml:space="preserve">新增，§5.6.6；实例拼接未完成）</w:t>
+      </w:r>
+      <w:r>
+        <w:rPr>
+          <w:rFonts w:hint="eastAsia"/>
+        </w:rPr>
+        <w:t xml:space="preserve">：频率阶梯原子族在</w:t>
+      </w:r>
+      <w:r>
+        <w:rPr>
+          <w:rFonts w:hint="eastAsia"/>
+          <w:b/>
+          <w:bCs/>
+        </w:rPr>
+        <w:t xml:space="preserve">通用层</w:t>
+      </w:r>
+      <w:r>
+        <w:rPr>
+          <w:rFonts w:hint="eastAsia"/>
+        </w:rPr>
+        <w:t xml:space="preserve">满足单位范数</w:t>
+      </w:r>
+      <w:r>
         <w:t xml:space="preserve"> → RIP(2,μ) → </w:t>
       </w:r>
       <w:r>
         <w:rPr>
           <w:rFonts w:hint="eastAsia"/>
-          <w:b/>
-          <w:bCs/>
-        </w:rPr>
-        <w:t xml:space="preserve">稀疏唯一恢复</w:t>
-      </w:r>
-      <w:r>
-        <w:rPr>
-          <w:rFonts w:hint="eastAsia"/>
-        </w:rPr>
-        <w:t xml:space="preserve">的完整链条——</w:t>
+        </w:rPr>
+        <w:t xml:space="preserve">稀疏唯一恢复定理（具体阶梯的</w:t>
+      </w:r>
+      <w:r>
+        <w:t xml:space="preserve"> μ·(M+1)&lt;1 </w:t>
+      </w:r>
+      <w:r>
+        <w:rPr>
+          <w:rFonts w:hint="eastAsia"/>
+        </w:rPr>
+        <w:t xml:space="preserve">实例化为后续工作）——</w:t>
       </w:r>
       <w:r>
         <w:rPr>
@@ -1720,16 +1723,25 @@
         <w:rPr>
           <w:rFonts w:hint="eastAsia"/>
         </w:rPr>
-        <w:t xml:space="preserve">原子稀疏表示唯一）——把「无条件基</w:t>
-      </w:r>
-      <w:r>
-        <w:t xml:space="preserve"> + </w:t>
-      </w:r>
-      <w:r>
-        <w:rPr>
-          <w:rFonts w:hint="eastAsia"/>
-        </w:rPr>
-        <w:t xml:space="preserve">频率阶梯」的理论优势从框架界推进到稀疏恢复（48</w:t>
+        <w:t xml:space="preserve">原子稀疏表示唯一）——把「框架界（1D</w:t>
+      </w:r>
+      <w:r>
+        <w:t xml:space="preserve"> </w:t>
+      </w:r>
+      <w:r>
+        <w:rPr>
+          <w:rFonts w:hint="eastAsia"/>
+        </w:rPr>
+        <w:t xml:space="preserve">无条件基）+</w:t>
+      </w:r>
+      <w:r>
+        <w:t xml:space="preserve"> </w:t>
+      </w:r>
+      <w:r>
+        <w:rPr>
+          <w:rFonts w:hint="eastAsia"/>
+        </w:rPr>
+        <w:t xml:space="preserve">频率阶梯」的理论优势从表示稳定性推进到稀疏恢复（48</w:t>
       </w:r>
       <w:r>
         <w:t xml:space="preserve"> </w:t>
@@ -3789,19 +3801,37 @@
           <w:b/>
           <w:bCs/>
         </w:rPr>
-        <w:t xml:space="preserve">项零经典排中</w:t>
-      </w:r>
-      <w:r>
-        <w:rPr>
-          <w:rFonts w:hint="eastAsia"/>
-        </w:rPr>
-        <w:t xml:space="preserve">（</w:t>
-      </w:r>
-      <w:r>
-        <w:rPr>
-          <w:rStyle w:val="VerbatimChar"/>
+        <w:t xml:space="preserve">项未直接使用</w:t>
+      </w:r>
+      <w:r>
+        <w:rPr>
+          <w:b/>
+          <w:bCs/>
+        </w:rPr>
+        <w:t xml:space="preserve"> </w:t>
+      </w:r>
+      <w:r>
+        <w:rPr>
+          <w:rStyle w:val="VerbatimChar"/>
+          <w:b/>
+          <w:bCs/>
         </w:rPr>
         <w:t xml:space="preserve">Classical_Prop.classic</w:t>
+      </w:r>
+      <w:r>
+        <w:rPr>
+          <w:rFonts w:hint="eastAsia"/>
+        </w:rPr>
+        <w:t xml:space="preserve">（排中律宏零出现；公理脚印含</w:t>
+      </w:r>
+      <w:r>
+        <w:t xml:space="preserve"> </w:t>
+      </w:r>
+      <w:r>
+        <w:rPr>
+          <w:rFonts w:hint="eastAsia"/>
+        </w:rPr>
+        <w:t xml:space="preserve">sig_not_dec/sig_forall_dec/fext——非构造性选择类公理，非”零经典”）</w:t>
       </w:r>
       <w:r>
         <w:t xml:space="preserve"> </w:t>
@@ -7493,7 +7523,7 @@
       </w:r>
     </w:p>
     <w:bookmarkEnd w:id="16"/>
-    <w:bookmarkStart w:id="17" w:name="维度推广三维四维2d-wide-张量积无条件基"/>
+    <w:bookmarkStart w:id="17" w:name="维度推广三维四维2d-wide-张量积范数上界组合性演示下界平凡非框架下界"/>
     <w:p>
       <w:pPr>
         <w:pStyle w:val="Heading3"/>
@@ -7514,7 +7544,7 @@
         <w:rPr>
           <w:rFonts w:hint="eastAsia"/>
         </w:rPr>
-        <w:t xml:space="preserve">张量积无条件基</w:t>
+        <w:t xml:space="preserve">张量积范数上界（组合性演示；下界平凡，非框架下界）</w:t>
       </w:r>
     </w:p>
     <w:p>
@@ -13341,6 +13371,65 @@
           <w:rFonts w:hint="eastAsia"/>
         </w:rPr>
         <w:t xml:space="preserve">长期项。</w:t>
+      </w:r>
+      <w:r>
+        <w:rPr>
+          <w:rFonts w:hint="eastAsia"/>
+          <w:b/>
+          <w:bCs/>
+        </w:rPr>
+        <w:t xml:space="preserve">外部依赖（mathcomp、Coquelicot）未纳入</w:t>
+      </w:r>
+      <w:r>
+        <w:rPr>
+          <w:b/>
+          <w:bCs/>
+        </w:rPr>
+        <w:t xml:space="preserve"> 165 </w:t>
+      </w:r>
+      <w:r>
+        <w:rPr>
+          <w:rFonts w:hint="eastAsia"/>
+          <w:b/>
+          <w:bCs/>
+        </w:rPr>
+        <w:t xml:space="preserve">项审计</w:t>
+      </w:r>
+      <w:r>
+        <w:t xml:space="preserve">——</w:t>
+      </w:r>
+      <w:r>
+        <w:rPr>
+          <w:rFonts w:hint="eastAsia"/>
+        </w:rPr>
+        <w:t xml:space="preserve">“零</w:t>
+      </w:r>
+      <w:r>
+        <w:t xml:space="preserve"> </w:t>
+      </w:r>
+      <w:r>
+        <w:rPr>
+          <w:rStyle w:val="VerbatimChar"/>
+        </w:rPr>
+        <w:t xml:space="preserve">Classical_Prop.classic</w:t>
+      </w:r>
+      <w:r>
+        <w:t xml:space="preserve">”</w:t>
+      </w:r>
+      <w:r>
+        <w:rPr>
+          <w:rFonts w:hint="eastAsia"/>
+        </w:rPr>
+        <w:t xml:space="preserve">结论仅限本开发应用层，不推广到整个开发依赖（Coquelicot</w:t>
+      </w:r>
+      <w:r>
+        <w:t xml:space="preserve"> </w:t>
+      </w:r>
+      <w:r>
+        <w:rPr>
+          <w:rFonts w:hint="eastAsia"/>
+        </w:rPr>
+        <w:t xml:space="preserve">基于实数库，可能含经典公理，如实声明）。</w:t>
       </w:r>
     </w:p>
     <w:bookmarkEnd w:id="28"/>
@@ -14435,6 +14524,71 @@
         </w:rPr>
         <w:t xml:space="preserve">单个种子）。</w:t>
       </w:r>
+      <w:r>
+        <w:rPr>
+          <w:rFonts w:hint="eastAsia"/>
+          <w:b/>
+          <w:bCs/>
+        </w:rPr>
+        <w:t xml:space="preserve">对论文</w:t>
+      </w:r>
+      <w:r>
+        <w:rPr>
+          <w:b/>
+          <w:bCs/>
+        </w:rPr>
+        <w:t xml:space="preserve"> B </w:t>
+      </w:r>
+      <w:r>
+        <w:rPr>
+          <w:rFonts w:hint="eastAsia"/>
+          <w:b/>
+          <w:bCs/>
+        </w:rPr>
+        <w:t xml:space="preserve">的依赖（如实）</w:t>
+      </w:r>
+      <w:r>
+        <w:rPr>
+          <w:rFonts w:hint="eastAsia"/>
+        </w:rPr>
+        <w:t xml:space="preserve">：本文多处引用论文</w:t>
+      </w:r>
+      <w:r>
+        <w:t xml:space="preserve"> B </w:t>
+      </w:r>
+      <w:r>
+        <w:rPr>
+          <w:rFonts w:hint="eastAsia"/>
+        </w:rPr>
+        <w:t xml:space="preserve">的实证结论（七带基线、psi-rope-rand</w:t>
+      </w:r>
+      <w:r>
+        <w:t xml:space="preserve"> </w:t>
+      </w:r>
+      <w:r>
+        <w:rPr>
+          <w:rFonts w:hint="eastAsia"/>
+        </w:rPr>
+        <w:t xml:space="preserve">等）作为动机与对照——论文</w:t>
+      </w:r>
+      <w:r>
+        <w:t xml:space="preserve"> B </w:t>
+      </w:r>
+      <w:r>
+        <w:rPr>
+          <w:rFonts w:hint="eastAsia"/>
+        </w:rPr>
+        <w:t xml:space="preserve">为独立投稿的预印本，其实验结论未经本审稿流程评审；本文的形式化贡献（框架界/衰减界/证书）不依赖论文</w:t>
+      </w:r>
+      <w:r>
+        <w:t xml:space="preserve"> B </w:t>
+      </w:r>
+      <w:r>
+        <w:rPr>
+          <w:rFonts w:hint="eastAsia"/>
+        </w:rPr>
+        <w:t xml:space="preserve">的实证有效性，两者正交。</w:t>
+      </w:r>
     </w:p>
     <w:p>
       <w:pPr>
@@ -15049,28 +15203,37 @@
           <w:b/>
           <w:bCs/>
         </w:rPr>
-        <w:t xml:space="preserve">压缩感知（v2.1</w:t>
-      </w:r>
-      <w:r>
-        <w:rPr>
-          <w:b/>
-          <w:bCs/>
-        </w:rPr>
-        <w:t xml:space="preserve"> </w:t>
-      </w:r>
-      <w:r>
-        <w:rPr>
-          <w:rFonts w:hint="eastAsia"/>
-          <w:b/>
-          <w:bCs/>
-        </w:rPr>
-        <w:t xml:space="preserve">新增，§5.6.6）</w:t>
-      </w:r>
-      <w:r>
-        <w:rPr>
-          <w:rFonts w:hint="eastAsia"/>
-        </w:rPr>
-        <w:t xml:space="preserve">：频率阶梯原子族获压缩感知级理论保证（单位范数</w:t>
+        <w:t xml:space="preserve">压缩感知通用层形式化（v2.1</w:t>
+      </w:r>
+      <w:r>
+        <w:rPr>
+          <w:b/>
+          <w:bCs/>
+        </w:rPr>
+        <w:t xml:space="preserve"> </w:t>
+      </w:r>
+      <w:r>
+        <w:rPr>
+          <w:rFonts w:hint="eastAsia"/>
+          <w:b/>
+          <w:bCs/>
+        </w:rPr>
+        <w:t xml:space="preserve">新增，§5.6.6；实例拼接未完成）</w:t>
+      </w:r>
+      <w:r>
+        <w:rPr>
+          <w:rFonts w:hint="eastAsia"/>
+        </w:rPr>
+        <w:t xml:space="preserve">：频率阶梯原子族在通用层获低相干</w:t>
+      </w:r>
+      <w:r>
+        <w:t xml:space="preserve"> → RIP(2,μ) → </w:t>
+      </w:r>
+      <w:r>
+        <w:rPr>
+          <w:rFonts w:hint="eastAsia"/>
+        </w:rPr>
+        <w:t xml:space="preserve">稀疏唯一性定理（单位范数</w:t>
       </w:r>
       <w:r>
         <w:t xml:space="preserve"> </w:t>
@@ -15130,7 +15293,7 @@
         <w:rPr>
           <w:rFonts w:hint="eastAsia"/>
         </w:rPr>
-        <w:t xml:space="preserve">并入合并版）——「无条件基</w:t>
+        <w:t xml:space="preserve">并入合并版）——「框架界</w:t>
       </w:r>
       <w:r>
         <w:t xml:space="preserve"> + </w:t>

</xml_diff>